<commit_message>
adding credits to the credit folder
</commit_message>
<xml_diff>
--- a/Docs/creditsShrimpCouncil.docx
+++ b/Docs/creditsShrimpCouncil.docx
@@ -118,6 +118,96 @@
           <w:t>https://assetstore.unity.com/packages/vfx/particles/free-game-vfx-magic-circle-urp-344984</w:t>
         </w:r>
       </w:hyperlink>
+    </w:p>
+    <w:p>
+      <w:hyperlink r:id="rId17" w:history="1">
+        <w:r>
+          <w:rPr>
+            <w:rStyle w:val="Hyperlink"/>
+          </w:rPr>
+          <w:t>https://assetstore.unity.com/packages/vfx/particles/spells/magic-effects-free-247933</w:t>
+        </w:r>
+      </w:hyperlink>
+      <w:r>
+        <w:t xml:space="preserve"> </w:t>
+      </w:r>
+    </w:p>
+    <w:p>
+      <w:hyperlink r:id="rId18" w:history="1">
+        <w:r>
+          <w:rPr>
+            <w:rStyle w:val="Hyperlink"/>
+          </w:rPr>
+          <w:t>https://</w:t>
+        </w:r>
+        <w:r>
+          <w:rPr>
+            <w:rStyle w:val="Hyperlink"/>
+          </w:rPr>
+          <w:t>assetstore.unity.com/packages/p/ancient-ruins-and-plants-20191</w:t>
+        </w:r>
+        <w:r>
+          <w:rPr>
+            <w:rStyle w:val="Hyperlink"/>
+          </w:rPr>
+          <w:t>4</w:t>
+        </w:r>
+      </w:hyperlink>
+      <w:r>
+        <w:t xml:space="preserve"> </w:t>
+      </w:r>
+    </w:p>
+    <w:p>
+      <w:hyperlink r:id="rId19" w:history="1">
+        <w:r>
+          <w:rPr>
+            <w:rStyle w:val="Hyperlink"/>
+          </w:rPr>
+          <w:t>https://assetstore.unity.com/packages/3d/environments/urban/modular-lowpoly-streets-free-192094</w:t>
+        </w:r>
+      </w:hyperlink>
+      <w:r>
+        <w:t xml:space="preserve"> </w:t>
+      </w:r>
+    </w:p>
+    <w:p>
+      <w:hyperlink r:id="rId20" w:history="1">
+        <w:r>
+          <w:rPr>
+            <w:rStyle w:val="Hyperlink"/>
+          </w:rPr>
+          <w:t>https://assetstore.unity.com/packages/3d/props/versatile-building-kit-15-medium-poly-models-for-game-developmen-303398</w:t>
+        </w:r>
+      </w:hyperlink>
+      <w:r>
+        <w:t xml:space="preserve"> </w:t>
+      </w:r>
+    </w:p>
+    <w:p>
+      <w:hyperlink r:id="rId21" w:history="1">
+        <w:r>
+          <w:rPr>
+            <w:rStyle w:val="Hyperlink"/>
+          </w:rPr>
+          <w:t>https://assetstore.unity.com/packages/vfx/particles/free-quick-effects-vol-1-304424</w:t>
+        </w:r>
+      </w:hyperlink>
+      <w:r>
+        <w:t xml:space="preserve"> </w:t>
+      </w:r>
+    </w:p>
+    <w:p>
+      <w:hyperlink r:id="rId22" w:history="1">
+        <w:r>
+          <w:rPr>
+            <w:rStyle w:val="Hyperlink"/>
+          </w:rPr>
+          <w:t>https://assetstore.unity.com/packages/2d/textures-materials/nature/grass-flowers-pack-free-138810</w:t>
+        </w:r>
+      </w:hyperlink>
+      <w:r>
+        <w:t xml:space="preserve"> </w:t>
+      </w:r>
     </w:p>
     <w:p/>
     <w:sectPr>
@@ -1398,12 +1488,6 @@
 </file>
 
 <file path=customXml/item2.xml><?xml version="1.0" encoding="utf-8"?>
-<p:properties xmlns:p="http://schemas.microsoft.com/office/2006/metadata/properties" xmlns:xsi="http://www.w3.org/2001/XMLSchema-instance" xmlns:pc="http://schemas.microsoft.com/office/infopath/2007/PartnerControls">
-  <documentManagement/>
-</p:properties>
-</file>
-
-<file path=customXml/item3.xml><?xml version="1.0" encoding="utf-8"?>
 <ct:contentTypeSchema xmlns:ct="http://schemas.microsoft.com/office/2006/metadata/contentType" xmlns:ma="http://schemas.microsoft.com/office/2006/metadata/properties/metaAttributes" ct:_="" ma:_="" ma:contentTypeName="Document" ma:contentTypeID="0x01010006F513C4D28143489FA84F41673313D0" ma:contentTypeVersion="4" ma:contentTypeDescription="Create a new document." ma:contentTypeScope="" ma:versionID="f140774e9c088eb605c75ac874022fdd">
   <xsd:schema xmlns:xsd="http://www.w3.org/2001/XMLSchema" xmlns:xs="http://www.w3.org/2001/XMLSchema" xmlns:p="http://schemas.microsoft.com/office/2006/metadata/properties" xmlns:ns3="dacb2506-d2aa-4680-a689-81d5490d8965" targetNamespace="http://schemas.microsoft.com/office/2006/metadata/properties" ma:root="true" ma:fieldsID="e2dc0bfafaad2abd07aca00ec641657d" ns3:_="">
     <xsd:import namespace="dacb2506-d2aa-4680-a689-81d5490d8965"/>
@@ -1547,6 +1631,12 @@
 </ct:contentTypeSchema>
 </file>
 
+<file path=customXml/item3.xml><?xml version="1.0" encoding="utf-8"?>
+<p:properties xmlns:p="http://schemas.microsoft.com/office/2006/metadata/properties" xmlns:xsi="http://www.w3.org/2001/XMLSchema-instance" xmlns:pc="http://schemas.microsoft.com/office/infopath/2007/PartnerControls">
+  <documentManagement/>
+</p:properties>
+</file>
+
 <file path=customXml/itemProps1.xml><?xml version="1.0" encoding="utf-8"?>
 <ds:datastoreItem xmlns:ds="http://schemas.openxmlformats.org/officeDocument/2006/customXml" ds:itemID="{E7D0A095-2195-4A8B-9866-F406143DE2B8}">
   <ds:schemaRefs>
@@ -1556,15 +1646,6 @@
 </file>
 
 <file path=customXml/itemProps2.xml><?xml version="1.0" encoding="utf-8"?>
-<ds:datastoreItem xmlns:ds="http://schemas.openxmlformats.org/officeDocument/2006/customXml" ds:itemID="{71C77B3C-24F7-4842-A151-F762F3702203}">
-  <ds:schemaRefs>
-    <ds:schemaRef ds:uri="http://schemas.microsoft.com/office/2006/metadata/properties"/>
-    <ds:schemaRef ds:uri="http://schemas.microsoft.com/office/infopath/2007/PartnerControls"/>
-  </ds:schemaRefs>
-</ds:datastoreItem>
-</file>
-
-<file path=customXml/itemProps3.xml><?xml version="1.0" encoding="utf-8"?>
 <ds:datastoreItem xmlns:ds="http://schemas.openxmlformats.org/officeDocument/2006/customXml" ds:itemID="{7085134D-EB1B-4A7B-B65A-5C47BEEACBC2}">
   <ds:schemaRefs>
     <ds:schemaRef ds:uri="http://schemas.microsoft.com/office/2006/metadata/contentType"/>
@@ -1580,4 +1661,13 @@
     <ds:schemaRef ds:uri="http://schemas.microsoft.com/internal/obd"/>
   </ds:schemaRefs>
 </ds:datastoreItem>
+</file>
+
+<file path=customXml/itemProps3.xml><?xml version="1.0" encoding="utf-8"?>
+<ds:datastoreItem xmlns:ds="http://schemas.openxmlformats.org/officeDocument/2006/customXml" ds:itemID="{71C77B3C-24F7-4842-A151-F762F3702203}">
+  <ds:schemaRefs>
+    <ds:schemaRef ds:uri="http://schemas.microsoft.com/office/2006/metadata/properties"/>
+    <ds:schemaRef ds:uri="http://schemas.microsoft.com/office/infopath/2007/PartnerControls"/>
+  </ds:schemaRefs>
+</ds:datastoreItem>
 </file>
</xml_diff>

<commit_message>
Updated credits document with the 3rd party content I used
</commit_message>
<xml_diff>
--- a/Docs/creditsShrimpCouncil.docx
+++ b/Docs/creditsShrimpCouncil.docx
@@ -138,19 +138,7 @@
           <w:rPr>
             <w:rStyle w:val="Hyperlink"/>
           </w:rPr>
-          <w:t>https://</w:t>
-        </w:r>
-        <w:r>
-          <w:rPr>
-            <w:rStyle w:val="Hyperlink"/>
-          </w:rPr>
-          <w:t>assetstore.unity.com/packages/p/ancient-ruins-and-plants-20191</w:t>
-        </w:r>
-        <w:r>
-          <w:rPr>
-            <w:rStyle w:val="Hyperlink"/>
-          </w:rPr>
-          <w:t>4</w:t>
+          <w:t>https://assetstore.unity.com/packages/p/ancient-ruins-and-plants-201914</w:t>
         </w:r>
       </w:hyperlink>
       <w:r>
@@ -209,6 +197,19 @@
         <w:t xml:space="preserve"> </w:t>
       </w:r>
     </w:p>
+    <w:p>
+      <w:hyperlink r:id="rId23" w:history="1">
+        <w:r>
+          <w:rPr>
+            <w:rStyle w:val="Hyperlink"/>
+          </w:rPr>
+          <w:t>https://assetstore.unity.com/packages/tools/modeling/real-ivy-2-procedural-ivy-generator-181402</w:t>
+        </w:r>
+      </w:hyperlink>
+      <w:r>
+        <w:t xml:space="preserve"> </w:t>
+      </w:r>
+    </w:p>
     <w:p/>
     <w:sectPr>
       <w:pgSz w:w="11906" w:h="16838"/>
@@ -229,7 +230,7 @@
         <w:kern w:val="2"/>
         <w:sz w:val="24"/>
         <w:szCs w:val="24"/>
-        <w:lang w:val="en-NL" w:eastAsia="en-US" w:bidi="ar-SA"/>
+        <w:lang w:eastAsia="en-US" w:bidi="ar-SA"/>
         <w14:ligatures w14:val="standardContextual"/>
       </w:rPr>
     </w:rPrDefault>
@@ -1479,15 +1480,6 @@
 </file>
 
 <file path=customXml/item1.xml><?xml version="1.0" encoding="utf-8"?>
-<?mso-contentType ?>
-<FormTemplates xmlns="http://schemas.microsoft.com/sharepoint/v3/contenttype/forms">
-  <Display>DocumentLibraryForm</Display>
-  <Edit>DocumentLibraryForm</Edit>
-  <New>DocumentLibraryForm</New>
-</FormTemplates>
-</file>
-
-<file path=customXml/item2.xml><?xml version="1.0" encoding="utf-8"?>
 <ct:contentTypeSchema xmlns:ct="http://schemas.microsoft.com/office/2006/metadata/contentType" xmlns:ma="http://schemas.microsoft.com/office/2006/metadata/properties/metaAttributes" ct:_="" ma:_="" ma:contentTypeName="Document" ma:contentTypeID="0x01010006F513C4D28143489FA84F41673313D0" ma:contentTypeVersion="4" ma:contentTypeDescription="Create a new document." ma:contentTypeScope="" ma:versionID="f140774e9c088eb605c75ac874022fdd">
   <xsd:schema xmlns:xsd="http://www.w3.org/2001/XMLSchema" xmlns:xs="http://www.w3.org/2001/XMLSchema" xmlns:p="http://schemas.microsoft.com/office/2006/metadata/properties" xmlns:ns3="dacb2506-d2aa-4680-a689-81d5490d8965" targetNamespace="http://schemas.microsoft.com/office/2006/metadata/properties" ma:root="true" ma:fieldsID="e2dc0bfafaad2abd07aca00ec641657d" ns3:_="">
     <xsd:import namespace="dacb2506-d2aa-4680-a689-81d5490d8965"/>
@@ -1631,6 +1623,15 @@
 </ct:contentTypeSchema>
 </file>
 
+<file path=customXml/item2.xml><?xml version="1.0" encoding="utf-8"?>
+<?mso-contentType ?>
+<FormTemplates xmlns="http://schemas.microsoft.com/sharepoint/v3/contenttype/forms">
+  <Display>DocumentLibraryForm</Display>
+  <Edit>DocumentLibraryForm</Edit>
+  <New>DocumentLibraryForm</New>
+</FormTemplates>
+</file>
+
 <file path=customXml/item3.xml><?xml version="1.0" encoding="utf-8"?>
 <p:properties xmlns:p="http://schemas.microsoft.com/office/2006/metadata/properties" xmlns:xsi="http://www.w3.org/2001/XMLSchema-instance" xmlns:pc="http://schemas.microsoft.com/office/infopath/2007/PartnerControls">
   <documentManagement/>
@@ -1638,14 +1639,6 @@
 </file>
 
 <file path=customXml/itemProps1.xml><?xml version="1.0" encoding="utf-8"?>
-<ds:datastoreItem xmlns:ds="http://schemas.openxmlformats.org/officeDocument/2006/customXml" ds:itemID="{E7D0A095-2195-4A8B-9866-F406143DE2B8}">
-  <ds:schemaRefs>
-    <ds:schemaRef ds:uri="http://schemas.microsoft.com/sharepoint/v3/contenttype/forms"/>
-  </ds:schemaRefs>
-</ds:datastoreItem>
-</file>
-
-<file path=customXml/itemProps2.xml><?xml version="1.0" encoding="utf-8"?>
 <ds:datastoreItem xmlns:ds="http://schemas.openxmlformats.org/officeDocument/2006/customXml" ds:itemID="{7085134D-EB1B-4A7B-B65A-5C47BEEACBC2}">
   <ds:schemaRefs>
     <ds:schemaRef ds:uri="http://schemas.microsoft.com/office/2006/metadata/contentType"/>
@@ -1663,6 +1656,14 @@
 </ds:datastoreItem>
 </file>
 
+<file path=customXml/itemProps2.xml><?xml version="1.0" encoding="utf-8"?>
+<ds:datastoreItem xmlns:ds="http://schemas.openxmlformats.org/officeDocument/2006/customXml" ds:itemID="{E7D0A095-2195-4A8B-9866-F406143DE2B8}">
+  <ds:schemaRefs>
+    <ds:schemaRef ds:uri="http://schemas.microsoft.com/sharepoint/v3/contenttype/forms"/>
+  </ds:schemaRefs>
+</ds:datastoreItem>
+</file>
+
 <file path=customXml/itemProps3.xml><?xml version="1.0" encoding="utf-8"?>
 <ds:datastoreItem xmlns:ds="http://schemas.openxmlformats.org/officeDocument/2006/customXml" ds:itemID="{71C77B3C-24F7-4842-A151-F762F3702203}">
   <ds:schemaRefs>

</xml_diff>